<commit_message>
Update SQL Server Azure DBA CV summary
</commit_message>
<xml_diff>
--- a/Output/Pedro_Gutierrez_SQL_Server_Azure_DBA_CV.docx
+++ b/Output/Pedro_Gutierrez_SQL_Server_Azure_DBA_CV.docx
@@ -51,7 +51,7 @@
     </w:p>
     <w:p>
       <w:r>
-        <w:t>SQL Server DBA, SQL Developer, and Data Engineer with 15+ years of experience supporting production database environments, SQL development, BI platforms, ETL processes, reporting systems, and data warehouse solutions. Strong background in SQL Server administration, T-SQL development, stored procedures, query optimization, database migrations, Azure-based database environments, backup and recovery practices, operational documentation, and cross-functional support for development, analytics, and business teams. Comfortable working remotely, independently, and in English-speaking environments.</w:t>
+        <w:t>SQL Server DBA, SQL Developer, and Data Engineer with 15+ years of experience supporting production database environments, SQL development, BI platforms, ETL processes, reporting systems, and data warehouse solutions. Strong background in SQL Server administration, version upgrade planning/execution, regular patching cycles, performance tuning, T-SQL development, stored procedures, query optimization, database migrations, Azure SQL Managed Instance, Azure SQL Database, Azure-based database environments, backup and recovery practices, operational documentation, and cross-functional support for development, analytics, and business teams. Comfortable working remotely, independently, coordinating technical work with peers and stakeholders, and operating with autonomy in English-speaking environments.</w:t>
       </w:r>
     </w:p>
     <w:p>
@@ -65,12 +65,12 @@
     </w:p>
     <w:p>
       <w:r>
-        <w:t>Databases: Microsoft SQL Server, Azure SQL Database, Azure SQL Managed Instance, PostgreSQL, MySQL, Snowflake.</w:t>
+        <w:t>Databases: Microsoft SQL Server, Azure SQL Managed Instance, Azure SQL Database, PostgreSQL, MySQL, Snowflake.</w:t>
       </w:r>
     </w:p>
     <w:p>
       <w:r>
-        <w:t>SQL / Development: T-SQL, stored procedures, functions, views, indexing, query tuning, execution plan analysis, data validation.</w:t>
+        <w:t>SQL / Development: T-SQL, stored procedures, functions, views, indexing, query tuning, execution plan analysis, version upgrade support, regular patching cycles, performance tuning, data validation.</w:t>
       </w:r>
     </w:p>
     <w:p>
@@ -80,7 +80,7 @@
     </w:p>
     <w:p>
       <w:r>
-        <w:t>Cloud / Automation: Azure, PowerShell, Python, Git, CI/CD exposure, Snowflake Cortex, AI-assisted development tools.</w:t>
+        <w:t>Cloud / Automation: Azure, backup and recovery practices, PowerShell, Python, Git, CI/CD exposure, Snowflake Cortex, AI-assisted development tools.</w:t>
       </w:r>
     </w:p>
     <w:p>

</xml_diff>